<commit_message>
Rewritten notebook file into a .py file with functions
Takes more data points and allows for user input
</commit_message>
<xml_diff>
--- a/SprintRetros.docx
+++ b/SprintRetros.docx
@@ -88,8 +88,91 @@
     </w:p>
     <w:p>
       <w:pPr>
+        <w:pStyle w:val="ListParagraph"/>
+        <w:numPr>
+          <w:ilvl w:val="0"/>
+          <w:numId w:val="2"/>
+        </w:numPr>
+      </w:pPr>
+    </w:p>
+    <w:p>
+      <w:r>
+        <w:t>Sprint 1 retrospective</w:t>
+      </w:r>
+    </w:p>
+    <w:p/>
+    <w:p/>
+    <w:p>
+      <w:pPr>
         <w:ind w:left="360"/>
       </w:pPr>
+    </w:p>
+    <w:p>
+      <w:r>
+        <w:t>Sprint 2 (20/02/2025 – 05/03/2025)</w:t>
+      </w:r>
+    </w:p>
+    <w:p>
+      <w:r>
+        <w:t xml:space="preserve">Goals: </w:t>
+      </w:r>
+    </w:p>
+    <w:p>
+      <w:pPr>
+        <w:pStyle w:val="ListParagraph"/>
+        <w:numPr>
+          <w:ilvl w:val="0"/>
+          <w:numId w:val="3"/>
+        </w:numPr>
+      </w:pPr>
+      <w:r>
+        <w:t>Expand upon sprint 1 model to use more bands than the singular thermal band</w:t>
+      </w:r>
+    </w:p>
+    <w:p>
+      <w:r>
+        <w:t>Deliverables</w:t>
+      </w:r>
+    </w:p>
+    <w:p>
+      <w:pPr>
+        <w:pStyle w:val="ListParagraph"/>
+        <w:numPr>
+          <w:ilvl w:val="0"/>
+          <w:numId w:val="3"/>
+        </w:numPr>
+      </w:pPr>
+      <w:r>
+        <w:t>Model or multiple models that form a prediction off of more than one band of data</w:t>
+      </w:r>
+    </w:p>
+    <w:p>
+      <w:r>
+        <w:t>Sprint 2 retrospective</w:t>
+      </w:r>
+    </w:p>
+    <w:p/>
+    <w:p>
+      <w:r>
+        <w:t xml:space="preserve">Sprint 3 </w:t>
+      </w:r>
+    </w:p>
+    <w:p>
+      <w:r>
+        <w:t>Goals:</w:t>
+      </w:r>
+    </w:p>
+    <w:p>
+      <w:pPr>
+        <w:pStyle w:val="ListParagraph"/>
+        <w:numPr>
+          <w:ilvl w:val="0"/>
+          <w:numId w:val="3"/>
+        </w:numPr>
+      </w:pPr>
+      <w:r>
+        <w:t>Create synthetic data for the model to train from as there is a lack of data which could cause inaccuracies</w:t>
+      </w:r>
     </w:p>
     <w:sectPr>
       <w:pgSz w:w="11906" w:h="16838"/>
@@ -217,6 +300,119 @@
     </w:lvl>
   </w:abstractNum>
   <w:abstractNum w:abstractNumId="1" w15:restartNumberingAfterBreak="0">
+    <w:nsid w:val="31606587"/>
+    <w:multiLevelType w:val="hybridMultilevel"/>
+    <w:tmpl w:val="A2CCF1E0"/>
+    <w:lvl w:ilvl="0" w:tplc="08090001">
+      <w:start w:val="1"/>
+      <w:numFmt w:val="bullet"/>
+      <w:lvlText w:val=""/>
+      <w:lvlJc w:val="left"/>
+      <w:pPr>
+        <w:ind w:left="720" w:hanging="360"/>
+      </w:pPr>
+      <w:rPr>
+        <w:rFonts w:ascii="Symbol" w:hAnsi="Symbol" w:hint="default"/>
+      </w:rPr>
+    </w:lvl>
+    <w:lvl w:ilvl="1" w:tplc="08090003" w:tentative="1">
+      <w:start w:val="1"/>
+      <w:numFmt w:val="bullet"/>
+      <w:lvlText w:val="o"/>
+      <w:lvlJc w:val="left"/>
+      <w:pPr>
+        <w:ind w:left="1440" w:hanging="360"/>
+      </w:pPr>
+      <w:rPr>
+        <w:rFonts w:ascii="Courier New" w:hAnsi="Courier New" w:cs="Courier New" w:hint="default"/>
+      </w:rPr>
+    </w:lvl>
+    <w:lvl w:ilvl="2" w:tplc="08090005" w:tentative="1">
+      <w:start w:val="1"/>
+      <w:numFmt w:val="bullet"/>
+      <w:lvlText w:val=""/>
+      <w:lvlJc w:val="left"/>
+      <w:pPr>
+        <w:ind w:left="2160" w:hanging="360"/>
+      </w:pPr>
+      <w:rPr>
+        <w:rFonts w:ascii="Wingdings" w:hAnsi="Wingdings" w:hint="default"/>
+      </w:rPr>
+    </w:lvl>
+    <w:lvl w:ilvl="3" w:tplc="08090001" w:tentative="1">
+      <w:start w:val="1"/>
+      <w:numFmt w:val="bullet"/>
+      <w:lvlText w:val=""/>
+      <w:lvlJc w:val="left"/>
+      <w:pPr>
+        <w:ind w:left="2880" w:hanging="360"/>
+      </w:pPr>
+      <w:rPr>
+        <w:rFonts w:ascii="Symbol" w:hAnsi="Symbol" w:hint="default"/>
+      </w:rPr>
+    </w:lvl>
+    <w:lvl w:ilvl="4" w:tplc="08090003" w:tentative="1">
+      <w:start w:val="1"/>
+      <w:numFmt w:val="bullet"/>
+      <w:lvlText w:val="o"/>
+      <w:lvlJc w:val="left"/>
+      <w:pPr>
+        <w:ind w:left="3600" w:hanging="360"/>
+      </w:pPr>
+      <w:rPr>
+        <w:rFonts w:ascii="Courier New" w:hAnsi="Courier New" w:cs="Courier New" w:hint="default"/>
+      </w:rPr>
+    </w:lvl>
+    <w:lvl w:ilvl="5" w:tplc="08090005" w:tentative="1">
+      <w:start w:val="1"/>
+      <w:numFmt w:val="bullet"/>
+      <w:lvlText w:val=""/>
+      <w:lvlJc w:val="left"/>
+      <w:pPr>
+        <w:ind w:left="4320" w:hanging="360"/>
+      </w:pPr>
+      <w:rPr>
+        <w:rFonts w:ascii="Wingdings" w:hAnsi="Wingdings" w:hint="default"/>
+      </w:rPr>
+    </w:lvl>
+    <w:lvl w:ilvl="6" w:tplc="08090001" w:tentative="1">
+      <w:start w:val="1"/>
+      <w:numFmt w:val="bullet"/>
+      <w:lvlText w:val=""/>
+      <w:lvlJc w:val="left"/>
+      <w:pPr>
+        <w:ind w:left="5040" w:hanging="360"/>
+      </w:pPr>
+      <w:rPr>
+        <w:rFonts w:ascii="Symbol" w:hAnsi="Symbol" w:hint="default"/>
+      </w:rPr>
+    </w:lvl>
+    <w:lvl w:ilvl="7" w:tplc="08090003" w:tentative="1">
+      <w:start w:val="1"/>
+      <w:numFmt w:val="bullet"/>
+      <w:lvlText w:val="o"/>
+      <w:lvlJc w:val="left"/>
+      <w:pPr>
+        <w:ind w:left="5760" w:hanging="360"/>
+      </w:pPr>
+      <w:rPr>
+        <w:rFonts w:ascii="Courier New" w:hAnsi="Courier New" w:cs="Courier New" w:hint="default"/>
+      </w:rPr>
+    </w:lvl>
+    <w:lvl w:ilvl="8" w:tplc="08090005" w:tentative="1">
+      <w:start w:val="1"/>
+      <w:numFmt w:val="bullet"/>
+      <w:lvlText w:val=""/>
+      <w:lvlJc w:val="left"/>
+      <w:pPr>
+        <w:ind w:left="6480" w:hanging="360"/>
+      </w:pPr>
+      <w:rPr>
+        <w:rFonts w:ascii="Wingdings" w:hAnsi="Wingdings" w:hint="default"/>
+      </w:rPr>
+    </w:lvl>
+  </w:abstractNum>
+  <w:abstractNum w:abstractNumId="2" w15:restartNumberingAfterBreak="0">
     <w:nsid w:val="650376F2"/>
     <w:multiLevelType w:val="hybridMultilevel"/>
     <w:tmpl w:val="FF90D9C6"/>
@@ -333,6 +529,9 @@
     <w:abstractNumId w:val="0"/>
   </w:num>
   <w:num w:numId="2" w16cid:durableId="457913065">
+    <w:abstractNumId w:val="2"/>
+  </w:num>
+  <w:num w:numId="3" w16cid:durableId="1590892926">
     <w:abstractNumId w:val="1"/>
   </w:num>
 </w:numbering>

</xml_diff>